<commit_message>
Testversion: Hub-Kopf und Fuss wie die Startseite
Co-Authored-By: Claude Opus 5.5 <noreply@anthropic.com>
</commit_message>
<xml_diff>
--- a/ki/download/studien-aktuell.docx
+++ b/ki/download/studien-aktuell.docx
@@ -62,7 +62,7 @@
           <w:color w:val="666666"/>
           <w:sz w:val="18"/>
         </w:rPr>
-        <w:t>Stand: 05.10.2026  |  7 Studien  |  ki.m-vf.de</w:t>
+        <w:t>Stand: 08.10.2026  |  5 Studien  |  ki.m-vf.de</w:t>
       </w:r>
     </w:p>
     <w:p>
@@ -70,7 +70,7 @@
         <w:pStyle w:val="Heading1"/>
       </w:pPr>
       <w:r>
-        <w:t>Aufgenommen am 05.10.2026</w:t>
+        <w:t>Aufgenommen am 08.10.2026</w:t>
       </w:r>
     </w:p>
     <w:p>
@@ -78,7 +78,7 @@
         <w:pStyle w:val="Heading2"/>
       </w:pPr>
       <w:r>
-        <w:t>EHR-Implementierung und Ärzte-Burnout: Dokumentationsbelastung als Schlüsselfaktor</w:t>
+        <w:t>KI-gestützte Prognosevorhersage im Schlaganfall: Echtzeit-Validierung in Klinikroutine</w:t>
       </w:r>
     </w:p>
     <w:p>
@@ -88,12 +88,12 @@
           <w:color w:val="666666"/>
           <w:sz w:val="18"/>
         </w:rPr>
-        <w:t>Lee YR et al.  ·  J Eval Clin Pract  ·  Okt. 2026  ·  PMID 42829915</w:t>
+        <w:t>Rubiera M et al.  ·  BMJ Open  ·  07.10.2026  ·  PMID 42843886</w:t>
       </w:r>
     </w:p>
     <w:p>
       <w:r>
-        <w:t>Prospektive Querschnittsstudie über drei Phasen einer systemweiten EHR-Einführung an einer akademischen Klinik zur Identifikation von Burnout-Faktoren bei Ärzten in Akut- und Rehabilitationskliniken.</w:t>
+        <w:t>Prospektive Studie zur Echtzeit-Validierung eines KI-Systems für individualisierte 3-Monats-Outcomes nach Schlaganfall in Schattenmode an 3 europäischen Schlaganfallzentren; Messung der klinischen Machbarkeit, Usability und Vorhersagegüte beim hyperakuten Behandlungsprozess.</w:t>
       </w:r>
     </w:p>
     <w:p>
@@ -104,7 +104,7 @@
         <w:t xml:space="preserve">Ergebnis: </w:t>
       </w:r>
       <w:r>
-        <w:t>Insgesamt blieb Burnout über die Implementierungsphasen stabil (p ≥ 0,05); Ärzte über 65 Jahren zeigten durchgehend protektive Effekte (adjustierte Odds Ratio 0,33–0,49); erhöhte Abenddokumentation ("Pyjama Time") korrelierte mit höherem depersonalization-Score (aOR 1,07; p=0,02), insbesondere in der Post-Implementierungsphase mit durchschnittlich 381,6 Min./Tag.</w:t>
+        <w:t>Studienprotokoll (Rekrutierung läuft); primäre Ergebnisse zu Machbarkeit, Usability und Vorhersagegüte waren zum Zeitpunkt der Publikation noch ausstehend. Sekundäre Endpunkte: Übereinstimmung zwischen KI-empfohlener und tatsächlicher Therapie sowie Validierung an Subgruppen.</w:t>
       </w:r>
     </w:p>
     <w:p>
@@ -119,7 +119,7 @@
         <w:rPr>
           <w:sz w:val="19"/>
         </w:rPr>
-        <w:t>Kanada (Toronto), vergleichbare Gesundheitssystem-Struktur, aber zeigt typische EHR-Implementierungsprobleme</w:t>
+        <w:t>Drei europäische Zentren (Spanien, Deutschland, Israel), vergleichbare Klinikstrukturen.</w:t>
       </w:r>
     </w:p>
     <w:p>
@@ -128,7 +128,7 @@
           <w:color w:val="5A7D3A"/>
           <w:sz w:val="18"/>
         </w:rPr>
-        <w:t>https://pubmed.ncbi.nlm.nih.gov/42829915/</w:t>
+        <w:t>https://pubmed.ncbi.nlm.nih.gov/42843886/</w:t>
       </w:r>
     </w:p>
     <w:p>
@@ -136,7 +136,7 @@
         <w:pStyle w:val="Heading2"/>
       </w:pPr>
       <w:r>
-        <w:t>KI-gestützte zweite Lesart von Zahnröntgenbildern: Verbesserung der Karieserkennung</w:t>
+        <w:t>Telemedizin in österreichischen Gefängnissen: Qualitative Implementierungsstudie</w:t>
       </w:r>
     </w:p>
     <w:p>
@@ -146,12 +146,12 @@
           <w:color w:val="666666"/>
           <w:sz w:val="18"/>
         </w:rPr>
-        <w:t>Šmucler R  ·  Cas Lek Cesk  ·  2026  ·  PMID 42829829</w:t>
+        <w:t>Doppler K et al.  ·  BMJ Open  ·  07.10.2026  ·  PMID 42843879</w:t>
       </w:r>
     </w:p>
     <w:p>
       <w:r>
-        <w:t>Analyse des Einsatzes von KI als zweites Leseverfahren bei Bissflügelaufnahmen zur Früherkennung approximaler Schmelzkaries in der zahnärztlichen Praxis.</w:t>
+        <w:t>Qualitative Studie mit 48 Interviews (35 Pflegekräfte, 3 Ärzte, 7 Direktoren, 3 Beamte) zur Integration von Telemedizin in Haftkrankenstationen bei Ärztemangel; Erfassung von Nutzung, Herausforderungen und Bedingungen für nachhaltige Skalierung.</w:t>
       </w:r>
     </w:p>
     <w:p>
@@ -162,7 +162,7 @@
         <w:t xml:space="preserve">Ergebnis: </w:t>
       </w:r>
       <w:r>
-        <w:t>Ohne KI-Unterstützung erkannten Zahnärzte 44,3 % approximaler Schmelzläsionen, mit KI-Assistenz 75,8 % – ein Unterschied von 31,5 Prozentpunkten; sichere Implementierung erfordert KI als zweites Leseverfahren, klinische Überprüfung falsch-positiver Befunde und Beibehaltung der Kliniker-Verantwortung.</w:t>
+        <w:t>Telemedizin bewährte sich für Rezepturionen, Follow-ups, Befundbesprechungen und Verwaltungsaufgaben. Emergente Notfälle und körperliche Untersuchungen waren ungeeignet. Pflegekräfte als zentrale operative Akteure: Arbeitsbelastung stieg (Koordination) oder sank (weniger externe Transfers) je nach Kontext. Erfolg hing ab von technischer Zuverlässigkeit, stabiler Zuordnung der Fernkliniker und deren Kenntnis der Gegebenheiten.</w:t>
       </w:r>
     </w:p>
     <w:p>
@@ -177,7 +177,7 @@
         <w:rPr>
           <w:sz w:val="19"/>
         </w:rPr>
-        <w:t>Zahnmedizin, Deutschland – ähnliche diagnostische Anforderungen und Dokumentationspraktiken</w:t>
+        <w:t>Österreich, vergleichbares Sozialversicherungssystem, europäische Regulierung.</w:t>
       </w:r>
     </w:p>
     <w:p>
@@ -186,7 +186,7 @@
           <w:color w:val="5A7D3A"/>
           <w:sz w:val="18"/>
         </w:rPr>
-        <w:t>https://pubmed.ncbi.nlm.nih.gov/42829829/</w:t>
+        <w:t>https://pubmed.ncbi.nlm.nih.gov/42843879/</w:t>
       </w:r>
     </w:p>
     <w:p>
@@ -194,7 +194,7 @@
         <w:pStyle w:val="Heading2"/>
       </w:pPr>
       <w:r>
-        <w:t>Digitale Sprachdokumentation in der Klinik: Potenziale und Implementierungsrisiken</w:t>
+        <w:t>LLM-gestützte Erfassung kognitiver Sorgen in Elektronischen Patientenakten: Echtdatenstudie</w:t>
       </w:r>
     </w:p>
     <w:p>
@@ -204,12 +204,12 @@
           <w:color w:val="666666"/>
           <w:sz w:val="18"/>
         </w:rPr>
-        <w:t>Ettlerová T  ·  Cas Lek Cesk  ·  2026  ·  PMID 42829828</w:t>
+        <w:t>Wang L et al.  ·  JMIR Aging  ·  07.10.2026  ·  PMID 42842937</w:t>
       </w:r>
     </w:p>
     <w:p>
       <w:r>
-        <w:t>Überblick über Einsatz von KI-gestützten digitalen Scribern für automatisierte klinische Dokumentation in ambulanter und stationärer Versorgung unter Analyse von Evidenz, Nutzen, Risiken und Implementierungsanforderungen.</w:t>
+        <w:t>EHR-Observationsstudie bei 15.750 älteren Patienten (≥65 Jahre) mit normalen kognitiven Tests; LLM-gestützte NLP-Verarbeitung von Freitext-Notizen zur Identifikation dokumentierter kognitiver Sorgen und Analyse von Erfassungsdeterminanten.</w:t>
       </w:r>
     </w:p>
     <w:p>
@@ -220,7 +220,7 @@
         <w:t xml:space="preserve">Ergebnis: </w:t>
       </w:r>
       <w:r>
-        <w:t>Studien deuten auf Reduktion der Dokumentationszeit, geringere kognitive Last und bessere Arzt-Patient-Aufmerksamkeit hin; erhebliche Risiken sind Ungenauigkeiten, Auslassungen, überlange Noten und Medikationsfehler – sichere Implementierung erfordert qualifizierte menschliche Überprüfung und Workflow-Integration.</w:t>
+        <w:t>Von 15.750 Patienten hatten 13,8% (n=2.175) dokumentierte kognitive Sorgen im Vorjahr in 1,2% der Notizen. Zweistufiges LLM-Pipeline (Med42-v2-8B + GPT-4o): Sensitivität 0,957, PPV 0,935, Spezifität 0,985, F1-Score 0,945. Stärkste Korrelate: Parkinson (aOR 5,29), TBI (aOR 4,63), Schlaganfall (aOR 3,46), Depression (aOR 1,54). Dokumentation seltener in benachteiligten Stadtvierteln (höherer Area Deprivation Index).</w:t>
       </w:r>
     </w:p>
     <w:p>
@@ -235,7 +235,7 @@
         <w:rPr>
           <w:sz w:val="19"/>
         </w:rPr>
-        <w:t>Tschechisches Gesundheitssystem, Evidenz übertragbar auf deutschsprachigen Raum mit ähnlichen Dokumentationspflichten</w:t>
+        <w:t>USA-Daten, aber NLP-Methodik und Equity-Befunde sind übertragbar; Anwendung auf deutsche EHR-Systeme möglich.</w:t>
       </w:r>
     </w:p>
     <w:p>
@@ -244,7 +244,7 @@
           <w:color w:val="5A7D3A"/>
           <w:sz w:val="18"/>
         </w:rPr>
-        <w:t>https://pubmed.ncbi.nlm.nih.gov/42829828/</w:t>
+        <w:t>https://pubmed.ncbi.nlm.nih.gov/42842937/</w:t>
       </w:r>
     </w:p>
     <w:p>
@@ -252,7 +252,7 @@
         <w:pStyle w:val="Heading2"/>
       </w:pPr>
       <w:r>
-        <w:t>Echtzeit-AI zur intraoperativen Anatomie-Segmentierung in der Neurochirurgie: erste Klinik-Evaluation</w:t>
+        <w:t>WeChat-Messaging für Medikamentenadhärenz nach Herzkatheter: Quasi-experimentelle Studie</w:t>
       </w:r>
     </w:p>
     <w:p>
@@ -262,12 +262,12 @@
           <w:color w:val="666666"/>
           <w:sz w:val="18"/>
         </w:rPr>
-        <w:t>Khan DZ et al.  ·  Pituitary  ·  03.10.2026  ·  PMID 42829367</w:t>
+        <w:t>Fang Y et al.  ·  J Med Internet Res  ·  07.10.2026  ·  PMID 42842839</w:t>
       </w:r>
     </w:p>
     <w:p>
       <w:r>
-        <w:t>IDEAL-Stage-1-Evaluierung von Echtzeit-Pixel-Level-Computer-Vision-KI zur anatomischen Segmentierung während endoskopischer transsphenoidaler Hypophysenchirurgie mit Fokus auf Machbarkeit, Nutzerinteraktion und klinische Sicherheit.</w:t>
+        <w:t>Quasi-experimentelle Studie mit 92 Patienten nach perkutaner Koronarintervention (PCI) in China; 12-Wochen-Intervention mit Behavior-Change-Wheel-gerahmten WeChat-Remindern und theoriegestützten Botschaften zu Fähigkeit, Gelegenheit und Motivation.</w:t>
       </w:r>
     </w:p>
     <w:p>
@@ -278,7 +278,7 @@
         <w:t xml:space="preserve">Ergebnis: </w:t>
       </w:r>
       <w:r>
-        <w:t>Bei acht Patienten mit Hypophysenadenomen gelang erfolgreiche KI-Deployment in sechs Fällen mit akzeptabler Sella-Segmentations-Genauigkeit; Deployment-Fehler in zwei Fällen aufgrund Boot-Konfiguration; Multiplikator-Feedback führte zur Integration zusätzlicher Struktur-Segmentationen (Karotis-Arterien) und Hardware-Upgrades; Chirurgisches Team bewertete Machbarkeit, Usability und Akzeptabilität zufriedenstellend; keine Sicherheitsvorfälle, keine AI-bedingten Komplikationen, keine signifikante Ablenkung des Operateurs.</w:t>
+        <w:t>Medikamentenadhärenz (MMAS-8): Intervention 7,40 vs. Kontrolle 6,22 (adjusted MD 1,18, 95% CI 0,96–1,40; p&lt;0,001). Sekundäre Outcomes: BMQ-Notwendigkeit (MD 1,62), BMQ-Sorgen (MD -3,25), Selbstwirksamkeit (MD 4,04), SAQ-Gesamtscore (MD 6,13; alle p&lt;0,001). Treatmentsatisfaction: kein signifikanter Unterschied. Per-Protocol und Differenzen-in-Differenzen-Analysen bestätigen Robustheit.</w:t>
       </w:r>
     </w:p>
     <w:p>
@@ -293,7 +293,7 @@
         <w:rPr>
           <w:sz w:val="19"/>
         </w:rPr>
-        <w:t>Großbritannien (UCL/NHS), hochentwickeltes System; Konzept auf deutsches Neurochirurgie-Setting übertragbar</w:t>
+        <w:t>China, digital fortgeschrittenes Setting; Botschaftsrahmen und Behavior-Change-Ansatz sind auf Deutschland übertragbar.</w:t>
       </w:r>
     </w:p>
     <w:p>
@@ -302,7 +302,7 @@
           <w:color w:val="5A7D3A"/>
           <w:sz w:val="18"/>
         </w:rPr>
-        <w:t>https://pubmed.ncbi.nlm.nih.gov/42829367/</w:t>
+        <w:t>https://pubmed.ncbi.nlm.nih.gov/42842839/</w:t>
       </w:r>
     </w:p>
     <w:p>
@@ -310,7 +310,7 @@
         <w:pStyle w:val="Heading2"/>
       </w:pPr>
       <w:r>
-        <w:t>Tiefenkamera-AI zur Sturzerfassung bei Parkinson und PSP: Datenschutz ohne Cloud-Abhängigkeit</w:t>
+        <w:t>Digitale Gesundheitsinterventionen in der Onkologie: RE-AIM-Analyse der externen Validität</w:t>
       </w:r>
     </w:p>
     <w:p>
@@ -320,12 +320,12 @@
           <w:color w:val="666666"/>
           <w:sz w:val="18"/>
         </w:rPr>
-        <w:t>Kamo H et al.  ·  Front Neurol  ·  18.09.2026  ·  PMID 42827797</w:t>
+        <w:t>Heifez M et al.  ·  Appl Psychol Health Well Being  ·  Okt. 2026  ·  PMID 42841441</w:t>
       </w:r>
     </w:p>
     <w:p>
       <w:r>
-        <w:t>Proof-of-Concept-Studie zur Echtzeit-Sturzerkennung durch privacy-preserving Edge-AI mit Tiefenkamera in einem Parkinson-Spezialwohnheim über 6.272 Monitoring-Stunden.</w:t>
+        <w:t>Systematische Übersicht über 191 RCTs und nicht-randomisierte Studien mit 29.907 Patienten und Betreuungspersonen zu digitalen Interventionen für psychologische und kognitive Aspekte bei Krebs; Bewertung mit RE-AIM-Framework zur Reichweite, Adoption und Verankerung im Alltag.</w:t>
       </w:r>
     </w:p>
     <w:p>
@@ -336,7 +336,7 @@
         <w:t xml:space="preserve">Ergebnis: </w:t>
       </w:r>
       <w:r>
-        <w:t>Bei 74 bestätigten Stürzen erreichte die KI eine Sensitivität von 52,7 % (post-Update 67,6 %) gegenüber 28,4 % konventioneller Facility-Meldung; positive prädiktive Wertigkeit 45,3 % (post-Update 41,8 %); Video-Analyse zeigte krankheitsspezifische Sturzmuster (PD mit mehr kognitiv-exekutiven Komponenten, PSP mit Gewichtsverlagerungs-Defiziten).</w:t>
+        <w:t>Reach, Effectiveness und Implementation wurden häufig berichtet, Adoption und Maintenance unterrepräsentiert. Trotz Berichte zu Effectiveness und Reach: begrenzte Evidenz zur externen Validität schränkt Skalierbarkeit ein. Schlüsselbefund: Fehlende Daten zu realer Übertragbarkeit und Nachhaltigkeit in Routineversorging.</w:t>
       </w:r>
     </w:p>
     <w:p>
@@ -351,7 +351,7 @@
         <w:rPr>
           <w:sz w:val="19"/>
         </w:rPr>
-        <w:t>Japan, Langzeitpflegeeinrichtung – Design auf europäische Pflege-Settings übertragbar, keine Cloud-Abhängigkeit</w:t>
+        <w:t>Internationale Evidenz mit EU-Perspektive; Transfer auf Deutschland erfordert Stärkung der Implementierungsforschung.</w:t>
       </w:r>
     </w:p>
     <w:p>
@@ -360,123 +360,7 @@
           <w:color w:val="5A7D3A"/>
           <w:sz w:val="18"/>
         </w:rPr>
-        <w:t>https://pubmed.ncbi.nlm.nih.gov/42827797/</w:t>
-      </w:r>
-    </w:p>
-    <w:p>
-      <w:pPr>
-        <w:pStyle w:val="Heading2"/>
-      </w:pPr>
-      <w:r>
-        <w:t>Digitale Gesundheitsbildung zur Steigerung von Versicherungsschutz bei Studierenden: RDD-Analyse</w:t>
-      </w:r>
-    </w:p>
-    <w:p>
-      <w:r>
-        <w:rPr>
-          <w:i/>
-          <w:color w:val="666666"/>
-          <w:sz w:val="18"/>
-        </w:rPr>
-        <w:t>Wang S et al.  ·  Front Public Health  ·  18.09.2026  ·  PMID 42827689</w:t>
-      </w:r>
-    </w:p>
-    <w:p>
-      <w:r>
-        <w:t>Quasi-experimentelle Studie mittels Regression-Discontinuity-Design zu Effekt einer campusweiten digitalen Gesundheitsaufklärung auf Versicherungsaktualisierung, Wissensstand und Kostenerstattungsquote bei Universitätsstudierenden.</w:t>
-      </w:r>
-    </w:p>
-    <w:p>
-      <w:r>
-        <w:rPr>
-          <w:b/>
-        </w:rPr>
-        <w:t xml:space="preserve">Ergebnis: </w:t>
-      </w:r>
-      <w:r>
-        <w:t>Nach Intervention stiegen Versicherungs-Enrollment von 87,3 auf 98,5 % (β=0,112, p&lt;0,001), Wissensstand von 42,1 auf 93,6 % (β=0,515, p&lt;0,001), erfolgreiche Kostenerstattung von 87,2 auf 97,7 % (β=0,105, p&lt;0,001); Ablehnungsquote sank um ~43 % (von 17,6 auf 10,1 %, Risikodifferenz 7,5 Prozentpunkte); Kognition und Handlungsfähigkeit erklärten 72 % der Mediationseffekte.</w:t>
-      </w:r>
-    </w:p>
-    <w:p>
-      <w:r>
-        <w:rPr>
-          <w:b/>
-          <w:sz w:val="19"/>
-        </w:rPr>
-        <w:t xml:space="preserve">Übertragbarkeit: </w:t>
-      </w:r>
-      <w:r>
-        <w:rPr>
-          <w:sz w:val="19"/>
-        </w:rPr>
-        <w:t>China (Shandong), aber Design und Erkenntnisse zur digitalen Gesundheitskommunikation übertragbar</w:t>
-      </w:r>
-    </w:p>
-    <w:p>
-      <w:r>
-        <w:rPr>
-          <w:color w:val="5A7D3A"/>
-          <w:sz w:val="18"/>
-        </w:rPr>
-        <w:t>https://pubmed.ncbi.nlm.nih.gov/42827689/</w:t>
-      </w:r>
-    </w:p>
-    <w:p>
-      <w:pPr>
-        <w:pStyle w:val="Heading2"/>
-      </w:pPr>
-      <w:r>
-        <w:t>Machine Learning zur Vorhersage langfristigen Gewichtserhalts nach Fasten: Mikrobiom- und klinische Prädiktoren</w:t>
-      </w:r>
-    </w:p>
-    <w:p>
-      <w:r>
-        <w:rPr>
-          <w:i/>
-          <w:color w:val="666666"/>
-          <w:sz w:val="18"/>
-        </w:rPr>
-        <w:t>Kaufhold G et al.  ·  Genome Med  ·  16.09.2026  ·  PMID 42754908</w:t>
-      </w:r>
-    </w:p>
-    <w:p>
-      <w:r>
-        <w:t>Randomisierte, wartelisten-kontrollierte Studie an 38 gesunden Erwachsenen mit 5-Tage-Fastenintervention und 12-Wochen-Follow-up; Machine-Learning-Modelle identifizierten Baseline-Prädiktoren des individuellen Gewichtsverlust-Ansprechens an Tag 84 und externe Validierung in drei unabhängigen Kohorten.</w:t>
-      </w:r>
-    </w:p>
-    <w:p>
-      <w:r>
-        <w:rPr>
-          <w:b/>
-        </w:rPr>
-        <w:t xml:space="preserve">Ergebnis: </w:t>
-      </w:r>
-      <w:r>
-        <w:t>Modell kombinierend Mikrobiom und klinische Variablen (Faecalibacterium-Art, Oscillibacter sp., LDL-Cholesterin, systolischer Blutdruck) sagte Gewichtsverlust-Response vorhersehbar; Modell generalisierte auf drei externe Kohorten einschließlich Metabolisches-Syndrom-Patienten und Multiple-Sklerose-Patienten mit wiederholtem Fasten; Baseline-Mikrobiom-Diversität assoziiert mit postfastingem Mikrobindiversitäts-Wandel.</w:t>
-      </w:r>
-    </w:p>
-    <w:p>
-      <w:r>
-        <w:rPr>
-          <w:b/>
-          <w:sz w:val="19"/>
-        </w:rPr>
-        <w:t xml:space="preserve">Übertragbarkeit: </w:t>
-      </w:r>
-      <w:r>
-        <w:rPr>
-          <w:sz w:val="19"/>
-        </w:rPr>
-        <w:t>Deutschland (Charité Berlin), prospektive Originaldaten, vergleichbare Bevölkerung</w:t>
-      </w:r>
-    </w:p>
-    <w:p>
-      <w:r>
-        <w:rPr>
-          <w:color w:val="5A7D3A"/>
-          <w:sz w:val="18"/>
-        </w:rPr>
-        <w:t>https://pubmed.ncbi.nlm.nih.gov/42754908/</w:t>
+        <w:t>https://pubmed.ncbi.nlm.nih.gov/42841441/</w:t>
       </w:r>
     </w:p>
     <w:sectPr>

</xml_diff>